<commit_message>
feat: init master thesis docx
</commit_message>
<xml_diff>
--- a/docs/thesis/meeting-preparation.docx
+++ b/docs/thesis/meeting-preparation.docx
@@ -7,8 +7,13 @@
         <w:pStyle w:val="Heading1"/>
       </w:pPr>
       <w:r>
-        <w:t>New Features</w:t>
-      </w:r>
+        <w:t xml:space="preserve">New </w:t>
+      </w:r>
+      <w:proofErr w:type="spellStart"/>
+      <w:r>
+        <w:t>Features</w:t>
+      </w:r>
+      <w:proofErr w:type="spellEnd"/>
     </w:p>
     <w:p>
       <w:pPr>
@@ -18,8 +23,93 @@
           <w:numId w:val="1"/>
         </w:numPr>
       </w:pPr>
-      <w:r>
-        <w:t>Deployed 12 different models and integrated them with my logic in the browser:</w:t>
+      <w:proofErr w:type="spellStart"/>
+      <w:r>
+        <w:t>Deployed</w:t>
+      </w:r>
+      <w:proofErr w:type="spellEnd"/>
+      <w:r>
+        <w:t xml:space="preserve"> 12 </w:t>
+      </w:r>
+      <w:proofErr w:type="spellStart"/>
+      <w:r>
+        <w:t>different</w:t>
+      </w:r>
+      <w:proofErr w:type="spellEnd"/>
+      <w:r>
+        <w:t xml:space="preserve"> </w:t>
+      </w:r>
+      <w:proofErr w:type="spellStart"/>
+      <w:r>
+        <w:t>models</w:t>
+      </w:r>
+      <w:proofErr w:type="spellEnd"/>
+      <w:r>
+        <w:t xml:space="preserve"> </w:t>
+      </w:r>
+      <w:proofErr w:type="spellStart"/>
+      <w:r>
+        <w:t>and</w:t>
+      </w:r>
+      <w:proofErr w:type="spellEnd"/>
+      <w:r>
+        <w:t xml:space="preserve"> </w:t>
+      </w:r>
+      <w:proofErr w:type="spellStart"/>
+      <w:r>
+        <w:t>integrated</w:t>
+      </w:r>
+      <w:proofErr w:type="spellEnd"/>
+      <w:r>
+        <w:t xml:space="preserve"> </w:t>
+      </w:r>
+      <w:proofErr w:type="spellStart"/>
+      <w:r>
+        <w:t>them</w:t>
+      </w:r>
+      <w:proofErr w:type="spellEnd"/>
+      <w:r>
+        <w:t xml:space="preserve"> </w:t>
+      </w:r>
+      <w:proofErr w:type="spellStart"/>
+      <w:r>
+        <w:t>with</w:t>
+      </w:r>
+      <w:proofErr w:type="spellEnd"/>
+      <w:r>
+        <w:t xml:space="preserve"> </w:t>
+      </w:r>
+      <w:proofErr w:type="spellStart"/>
+      <w:r>
+        <w:t>my</w:t>
+      </w:r>
+      <w:proofErr w:type="spellEnd"/>
+      <w:r>
+        <w:t xml:space="preserve"> </w:t>
+      </w:r>
+      <w:proofErr w:type="spellStart"/>
+      <w:r>
+        <w:t>logic</w:t>
+      </w:r>
+      <w:proofErr w:type="spellEnd"/>
+      <w:r>
+        <w:t xml:space="preserve"> in </w:t>
+      </w:r>
+      <w:proofErr w:type="spellStart"/>
+      <w:r>
+        <w:t>the</w:t>
+      </w:r>
+      <w:proofErr w:type="spellEnd"/>
+      <w:r>
+        <w:t xml:space="preserve"> </w:t>
+      </w:r>
+      <w:proofErr w:type="spellStart"/>
+      <w:r>
+        <w:t>browser</w:t>
+      </w:r>
+      <w:proofErr w:type="spellEnd"/>
+      <w:r>
+        <w:t>:</w:t>
       </w:r>
     </w:p>
     <w:p>
@@ -136,6 +226,9 @@
         </mc:AlternateContent>
       </w:r>
       <w:r>
+        <w:rPr>
+          <w:noProof/>
+        </w:rPr>
         <w:drawing>
           <wp:inline distT="0" distB="0" distL="0" distR="0" wp14:anchorId="695484A3" wp14:editId="1DAB8885">
             <wp:extent cx="5731510" cy="3537585"/>
@@ -181,8 +274,69 @@
           <w:numId w:val="1"/>
         </w:numPr>
       </w:pPr>
-      <w:r>
-        <w:t>Need to measure FPS for each of them on different phones – TODO</w:t>
+      <w:proofErr w:type="spellStart"/>
+      <w:r>
+        <w:t>Need</w:t>
+      </w:r>
+      <w:proofErr w:type="spellEnd"/>
+      <w:r>
+        <w:t xml:space="preserve"> to </w:t>
+      </w:r>
+      <w:proofErr w:type="spellStart"/>
+      <w:r>
+        <w:t>measure</w:t>
+      </w:r>
+      <w:proofErr w:type="spellEnd"/>
+      <w:r>
+        <w:t xml:space="preserve"> FPS </w:t>
+      </w:r>
+      <w:proofErr w:type="spellStart"/>
+      <w:r>
+        <w:t>for</w:t>
+      </w:r>
+      <w:proofErr w:type="spellEnd"/>
+      <w:r>
+        <w:t xml:space="preserve"> </w:t>
+      </w:r>
+      <w:proofErr w:type="spellStart"/>
+      <w:r>
+        <w:t>each</w:t>
+      </w:r>
+      <w:proofErr w:type="spellEnd"/>
+      <w:r>
+        <w:t xml:space="preserve"> </w:t>
+      </w:r>
+      <w:proofErr w:type="spellStart"/>
+      <w:r>
+        <w:t>of</w:t>
+      </w:r>
+      <w:proofErr w:type="spellEnd"/>
+      <w:r>
+        <w:t xml:space="preserve"> </w:t>
+      </w:r>
+      <w:proofErr w:type="spellStart"/>
+      <w:r>
+        <w:t>them</w:t>
+      </w:r>
+      <w:proofErr w:type="spellEnd"/>
+      <w:r>
+        <w:t xml:space="preserve"> on </w:t>
+      </w:r>
+      <w:proofErr w:type="spellStart"/>
+      <w:r>
+        <w:t>different</w:t>
+      </w:r>
+      <w:proofErr w:type="spellEnd"/>
+      <w:r>
+        <w:t xml:space="preserve"> </w:t>
+      </w:r>
+      <w:proofErr w:type="spellStart"/>
+      <w:r>
+        <w:t>phones</w:t>
+      </w:r>
+      <w:proofErr w:type="spellEnd"/>
+      <w:r>
+        <w:t xml:space="preserve"> – TODO</w:t>
       </w:r>
     </w:p>
     <w:p>
@@ -193,8 +347,29 @@
           <w:numId w:val="1"/>
         </w:numPr>
       </w:pPr>
-      <w:r>
-        <w:t>Picked accuracy metrics:</w:t>
+      <w:proofErr w:type="spellStart"/>
+      <w:r>
+        <w:t>Picked</w:t>
+      </w:r>
+      <w:proofErr w:type="spellEnd"/>
+      <w:r>
+        <w:t xml:space="preserve"> </w:t>
+      </w:r>
+      <w:proofErr w:type="spellStart"/>
+      <w:r>
+        <w:t>accuracy</w:t>
+      </w:r>
+      <w:proofErr w:type="spellEnd"/>
+      <w:r>
+        <w:t xml:space="preserve"> </w:t>
+      </w:r>
+      <w:proofErr w:type="spellStart"/>
+      <w:r>
+        <w:t>metrics</w:t>
+      </w:r>
+      <w:proofErr w:type="spellEnd"/>
+      <w:r>
+        <w:t>:</w:t>
       </w:r>
     </w:p>
     <w:p>
@@ -206,8 +381,45 @@
         </w:numPr>
       </w:pPr>
       <w:r>
-        <w:t>Total Keypoint Error vs Ground Truth</w:t>
-      </w:r>
+        <w:t xml:space="preserve">Total </w:t>
+      </w:r>
+      <w:proofErr w:type="spellStart"/>
+      <w:r>
+        <w:t>Keypoint</w:t>
+      </w:r>
+      <w:proofErr w:type="spellEnd"/>
+      <w:r>
+        <w:t xml:space="preserve"> </w:t>
+      </w:r>
+      <w:proofErr w:type="spellStart"/>
+      <w:r>
+        <w:t>Error</w:t>
+      </w:r>
+      <w:proofErr w:type="spellEnd"/>
+      <w:r>
+        <w:t xml:space="preserve"> </w:t>
+      </w:r>
+      <w:proofErr w:type="spellStart"/>
+      <w:r>
+        <w:t>vs</w:t>
+      </w:r>
+      <w:proofErr w:type="spellEnd"/>
+      <w:r>
+        <w:t xml:space="preserve"> </w:t>
+      </w:r>
+      <w:proofErr w:type="spellStart"/>
+      <w:r>
+        <w:t>Ground</w:t>
+      </w:r>
+      <w:proofErr w:type="spellEnd"/>
+      <w:r>
+        <w:t xml:space="preserve"> </w:t>
+      </w:r>
+      <w:proofErr w:type="spellStart"/>
+      <w:r>
+        <w:t>Truth</w:t>
+      </w:r>
+      <w:proofErr w:type="spellEnd"/>
     </w:p>
     <w:p>
       <w:pPr>
@@ -218,8 +430,45 @@
         </w:numPr>
       </w:pPr>
       <w:r>
-        <w:t>Avg Keypoint Error per image vs Ground Truth</w:t>
-      </w:r>
+        <w:t xml:space="preserve">Avg </w:t>
+      </w:r>
+      <w:proofErr w:type="spellStart"/>
+      <w:r>
+        <w:t>Keypoint</w:t>
+      </w:r>
+      <w:proofErr w:type="spellEnd"/>
+      <w:r>
+        <w:t xml:space="preserve"> </w:t>
+      </w:r>
+      <w:proofErr w:type="spellStart"/>
+      <w:r>
+        <w:t>Error</w:t>
+      </w:r>
+      <w:proofErr w:type="spellEnd"/>
+      <w:r>
+        <w:t xml:space="preserve"> per image </w:t>
+      </w:r>
+      <w:proofErr w:type="spellStart"/>
+      <w:r>
+        <w:t>vs</w:t>
+      </w:r>
+      <w:proofErr w:type="spellEnd"/>
+      <w:r>
+        <w:t xml:space="preserve"> </w:t>
+      </w:r>
+      <w:proofErr w:type="spellStart"/>
+      <w:r>
+        <w:t>Ground</w:t>
+      </w:r>
+      <w:proofErr w:type="spellEnd"/>
+      <w:r>
+        <w:t xml:space="preserve"> </w:t>
+      </w:r>
+      <w:proofErr w:type="spellStart"/>
+      <w:r>
+        <w:t>Truth</w:t>
+      </w:r>
+      <w:proofErr w:type="spellEnd"/>
     </w:p>
     <w:p>
       <w:pPr>
@@ -241,9 +490,100 @@
           <w:numId w:val="1"/>
         </w:numPr>
       </w:pPr>
-      <w:r>
-        <w:t>For each model total Keypoint Error vs Ground Truth for each Keypoint</w:t>
-      </w:r>
+      <w:proofErr w:type="spellStart"/>
+      <w:r>
+        <w:t>For</w:t>
+      </w:r>
+      <w:proofErr w:type="spellEnd"/>
+      <w:r>
+        <w:t xml:space="preserve"> </w:t>
+      </w:r>
+      <w:proofErr w:type="spellStart"/>
+      <w:r>
+        <w:t>each</w:t>
+      </w:r>
+      <w:proofErr w:type="spellEnd"/>
+      <w:r>
+        <w:t xml:space="preserve"> model total </w:t>
+      </w:r>
+      <w:proofErr w:type="spellStart"/>
+      <w:r>
+        <w:t>Keypoint</w:t>
+      </w:r>
+      <w:proofErr w:type="spellEnd"/>
+      <w:r>
+        <w:t xml:space="preserve"> </w:t>
+      </w:r>
+      <w:proofErr w:type="spellStart"/>
+      <w:r>
+        <w:t>Error</w:t>
+      </w:r>
+      <w:proofErr w:type="spellEnd"/>
+      <w:r>
+        <w:t xml:space="preserve"> </w:t>
+      </w:r>
+      <w:proofErr w:type="spellStart"/>
+      <w:r>
+        <w:t>vs</w:t>
+      </w:r>
+      <w:proofErr w:type="spellEnd"/>
+      <w:r>
+        <w:t xml:space="preserve"> </w:t>
+      </w:r>
+      <w:proofErr w:type="spellStart"/>
+      <w:r>
+        <w:t>Ground</w:t>
+      </w:r>
+      <w:proofErr w:type="spellEnd"/>
+      <w:r>
+        <w:t xml:space="preserve"> </w:t>
+      </w:r>
+      <w:proofErr w:type="spellStart"/>
+      <w:r>
+        <w:t>Truth</w:t>
+      </w:r>
+      <w:proofErr w:type="spellEnd"/>
+      <w:r>
+        <w:t xml:space="preserve"> </w:t>
+      </w:r>
+      <w:proofErr w:type="spellStart"/>
+      <w:r>
+        <w:t>for</w:t>
+      </w:r>
+      <w:proofErr w:type="spellEnd"/>
+      <w:r>
+        <w:t xml:space="preserve"> </w:t>
+      </w:r>
+      <w:proofErr w:type="spellStart"/>
+      <w:r>
+        <w:t>each</w:t>
+      </w:r>
+      <w:proofErr w:type="spellEnd"/>
+      <w:r>
+        <w:t xml:space="preserve"> </w:t>
+      </w:r>
+      <w:proofErr w:type="spellStart"/>
+      <w:r>
+        <w:t>Keypoint</w:t>
+      </w:r>
+      <w:proofErr w:type="spellEnd"/>
+      <w:r>
+        <w:t xml:space="preserve"> </w:t>
+      </w:r>
+      <w:r>
+        <w:t>–</w:t>
+      </w:r>
+      <w:r>
+        <w:t xml:space="preserve"> BOXPLOT</w:t>
+      </w:r>
+      <w:r>
+        <w:t xml:space="preserve"> – primer slike kjer je velik </w:t>
+      </w:r>
+      <w:proofErr w:type="spellStart"/>
+      <w:r>
+        <w:t>outlier</w:t>
+      </w:r>
+      <w:proofErr w:type="spellEnd"/>
     </w:p>
     <w:p>
       <w:pPr>
@@ -253,8 +593,45 @@
           <w:numId w:val="1"/>
         </w:numPr>
       </w:pPr>
-      <w:r>
-        <w:t>Measured accuracy metrics for each model on:</w:t>
+      <w:proofErr w:type="spellStart"/>
+      <w:r>
+        <w:t>Measured</w:t>
+      </w:r>
+      <w:proofErr w:type="spellEnd"/>
+      <w:r>
+        <w:t xml:space="preserve"> </w:t>
+      </w:r>
+      <w:proofErr w:type="spellStart"/>
+      <w:r>
+        <w:t>accuracy</w:t>
+      </w:r>
+      <w:proofErr w:type="spellEnd"/>
+      <w:r>
+        <w:t xml:space="preserve"> </w:t>
+      </w:r>
+      <w:proofErr w:type="spellStart"/>
+      <w:r>
+        <w:t>metrics</w:t>
+      </w:r>
+      <w:proofErr w:type="spellEnd"/>
+      <w:r>
+        <w:t xml:space="preserve"> </w:t>
+      </w:r>
+      <w:proofErr w:type="spellStart"/>
+      <w:r>
+        <w:t>for</w:t>
+      </w:r>
+      <w:proofErr w:type="spellEnd"/>
+      <w:r>
+        <w:t xml:space="preserve"> </w:t>
+      </w:r>
+      <w:proofErr w:type="spellStart"/>
+      <w:r>
+        <w:t>each</w:t>
+      </w:r>
+      <w:proofErr w:type="spellEnd"/>
+      <w:r>
+        <w:t xml:space="preserve"> model on:</w:t>
       </w:r>
     </w:p>
     <w:p>
@@ -266,10 +643,42 @@
         </w:numPr>
       </w:pPr>
       <w:r>
-        <w:t>DB Biceps Curl Video</w:t>
-      </w:r>
-      <w:r>
-        <w:t xml:space="preserve"> (cut frames from video)</w:t>
+        <w:t xml:space="preserve">DB Biceps </w:t>
+      </w:r>
+      <w:proofErr w:type="spellStart"/>
+      <w:r>
+        <w:t>Curl</w:t>
+      </w:r>
+      <w:proofErr w:type="spellEnd"/>
+      <w:r>
+        <w:t xml:space="preserve"> Video</w:t>
+      </w:r>
+      <w:r>
+        <w:t xml:space="preserve"> (</w:t>
+      </w:r>
+      <w:proofErr w:type="spellStart"/>
+      <w:r>
+        <w:t>cut</w:t>
+      </w:r>
+      <w:proofErr w:type="spellEnd"/>
+      <w:r>
+        <w:t xml:space="preserve"> </w:t>
+      </w:r>
+      <w:proofErr w:type="spellStart"/>
+      <w:r>
+        <w:t>frames</w:t>
+      </w:r>
+      <w:proofErr w:type="spellEnd"/>
+      <w:r>
+        <w:t xml:space="preserve"> </w:t>
+      </w:r>
+      <w:proofErr w:type="spellStart"/>
+      <w:r>
+        <w:t>from</w:t>
+      </w:r>
+      <w:proofErr w:type="spellEnd"/>
+      <w:r>
+        <w:t xml:space="preserve"> video)</w:t>
       </w:r>
     </w:p>
     <w:p>
@@ -284,7 +693,31 @@
         <w:t>CMJ Video</w:t>
       </w:r>
       <w:r>
-        <w:t xml:space="preserve"> (cut frames from video)</w:t>
+        <w:t xml:space="preserve"> (</w:t>
+      </w:r>
+      <w:proofErr w:type="spellStart"/>
+      <w:r>
+        <w:t>cut</w:t>
+      </w:r>
+      <w:proofErr w:type="spellEnd"/>
+      <w:r>
+        <w:t xml:space="preserve"> </w:t>
+      </w:r>
+      <w:proofErr w:type="spellStart"/>
+      <w:r>
+        <w:t>frames</w:t>
+      </w:r>
+      <w:proofErr w:type="spellEnd"/>
+      <w:r>
+        <w:t xml:space="preserve"> </w:t>
+      </w:r>
+      <w:proofErr w:type="spellStart"/>
+      <w:r>
+        <w:t>from</w:t>
+      </w:r>
+      <w:proofErr w:type="spellEnd"/>
+      <w:r>
+        <w:t xml:space="preserve"> video)</w:t>
       </w:r>
     </w:p>
     <w:p>
@@ -296,8 +729,13 @@
         </w:numPr>
       </w:pPr>
       <w:r>
-        <w:t>Test Dataset</w:t>
-      </w:r>
+        <w:t xml:space="preserve">Test </w:t>
+      </w:r>
+      <w:proofErr w:type="spellStart"/>
+      <w:r>
+        <w:t>Dataset</w:t>
+      </w:r>
+      <w:proofErr w:type="spellEnd"/>
     </w:p>
     <w:p>
       <w:pPr>
@@ -308,8 +746,53 @@
         </w:numPr>
       </w:pPr>
       <w:r>
-        <w:t>… I will add a bunch of other exercises</w:t>
-      </w:r>
+        <w:t xml:space="preserve">… I </w:t>
+      </w:r>
+      <w:proofErr w:type="spellStart"/>
+      <w:r>
+        <w:t>will</w:t>
+      </w:r>
+      <w:proofErr w:type="spellEnd"/>
+      <w:r>
+        <w:t xml:space="preserve"> </w:t>
+      </w:r>
+      <w:proofErr w:type="spellStart"/>
+      <w:r>
+        <w:t>add</w:t>
+      </w:r>
+      <w:proofErr w:type="spellEnd"/>
+      <w:r>
+        <w:t xml:space="preserve"> a </w:t>
+      </w:r>
+      <w:proofErr w:type="spellStart"/>
+      <w:r>
+        <w:t>bunch</w:t>
+      </w:r>
+      <w:proofErr w:type="spellEnd"/>
+      <w:r>
+        <w:t xml:space="preserve"> </w:t>
+      </w:r>
+      <w:proofErr w:type="spellStart"/>
+      <w:r>
+        <w:t>of</w:t>
+      </w:r>
+      <w:proofErr w:type="spellEnd"/>
+      <w:r>
+        <w:t xml:space="preserve"> </w:t>
+      </w:r>
+      <w:proofErr w:type="spellStart"/>
+      <w:r>
+        <w:t>other</w:t>
+      </w:r>
+      <w:proofErr w:type="spellEnd"/>
+      <w:r>
+        <w:t xml:space="preserve"> </w:t>
+      </w:r>
+      <w:proofErr w:type="spellStart"/>
+      <w:r>
+        <w:t>exercises</w:t>
+      </w:r>
+      <w:proofErr w:type="spellEnd"/>
     </w:p>
     <w:p>
       <w:pPr>
@@ -319,24 +802,193 @@
           <w:numId w:val="1"/>
         </w:numPr>
       </w:pPr>
-      <w:r>
-        <w:t>Created my own dataset – from images which got taken using the current deployed version</w:t>
-      </w:r>
-      <w:r>
-        <w:t xml:space="preserve">. Went through all of them and </w:t>
-      </w:r>
+      <w:proofErr w:type="spellStart"/>
+      <w:r>
+        <w:t>Created</w:t>
+      </w:r>
+      <w:proofErr w:type="spellEnd"/>
+      <w:r>
+        <w:t xml:space="preserve"> </w:t>
+      </w:r>
+      <w:proofErr w:type="spellStart"/>
+      <w:r>
+        <w:t>my</w:t>
+      </w:r>
+      <w:proofErr w:type="spellEnd"/>
+      <w:r>
+        <w:t xml:space="preserve"> </w:t>
+      </w:r>
+      <w:proofErr w:type="spellStart"/>
+      <w:r>
+        <w:t>own</w:t>
+      </w:r>
+      <w:proofErr w:type="spellEnd"/>
+      <w:r>
+        <w:t xml:space="preserve"> </w:t>
+      </w:r>
+      <w:proofErr w:type="spellStart"/>
+      <w:r>
+        <w:t>dataset</w:t>
+      </w:r>
+      <w:proofErr w:type="spellEnd"/>
+      <w:r>
+        <w:t xml:space="preserve"> – </w:t>
+      </w:r>
+      <w:proofErr w:type="spellStart"/>
+      <w:r>
+        <w:t>from</w:t>
+      </w:r>
+      <w:proofErr w:type="spellEnd"/>
+      <w:r>
+        <w:t xml:space="preserve"> </w:t>
+      </w:r>
+      <w:proofErr w:type="spellStart"/>
+      <w:r>
+        <w:t>images</w:t>
+      </w:r>
+      <w:proofErr w:type="spellEnd"/>
+      <w:r>
+        <w:t xml:space="preserve"> </w:t>
+      </w:r>
+      <w:proofErr w:type="spellStart"/>
+      <w:r>
+        <w:t>which</w:t>
+      </w:r>
+      <w:proofErr w:type="spellEnd"/>
+      <w:r>
+        <w:t xml:space="preserve"> </w:t>
+      </w:r>
+      <w:proofErr w:type="spellStart"/>
+      <w:r>
+        <w:t>got</w:t>
+      </w:r>
+      <w:proofErr w:type="spellEnd"/>
+      <w:r>
+        <w:t xml:space="preserve"> </w:t>
+      </w:r>
+      <w:proofErr w:type="spellStart"/>
+      <w:r>
+        <w:t>taken</w:t>
+      </w:r>
+      <w:proofErr w:type="spellEnd"/>
+      <w:r>
+        <w:t xml:space="preserve"> </w:t>
+      </w:r>
+      <w:proofErr w:type="spellStart"/>
+      <w:r>
+        <w:t>using</w:t>
+      </w:r>
+      <w:proofErr w:type="spellEnd"/>
+      <w:r>
+        <w:t xml:space="preserve"> </w:t>
+      </w:r>
+      <w:proofErr w:type="spellStart"/>
+      <w:r>
+        <w:t>the</w:t>
+      </w:r>
+      <w:proofErr w:type="spellEnd"/>
+      <w:r>
+        <w:t xml:space="preserve"> </w:t>
+      </w:r>
+      <w:proofErr w:type="spellStart"/>
+      <w:r>
+        <w:t>current</w:t>
+      </w:r>
+      <w:proofErr w:type="spellEnd"/>
+      <w:r>
+        <w:t xml:space="preserve"> </w:t>
+      </w:r>
+      <w:proofErr w:type="spellStart"/>
+      <w:r>
+        <w:t>deployed</w:t>
+      </w:r>
+      <w:proofErr w:type="spellEnd"/>
+      <w:r>
+        <w:t xml:space="preserve"> </w:t>
+      </w:r>
+      <w:proofErr w:type="spellStart"/>
+      <w:r>
+        <w:t>version</w:t>
+      </w:r>
+      <w:proofErr w:type="spellEnd"/>
+      <w:r>
+        <w:t xml:space="preserve">. </w:t>
+      </w:r>
+      <w:proofErr w:type="spellStart"/>
+      <w:r>
+        <w:t>Went</w:t>
+      </w:r>
+      <w:proofErr w:type="spellEnd"/>
+      <w:r>
+        <w:t xml:space="preserve"> </w:t>
+      </w:r>
+      <w:proofErr w:type="spellStart"/>
+      <w:r>
+        <w:t>through</w:t>
+      </w:r>
+      <w:proofErr w:type="spellEnd"/>
+      <w:r>
+        <w:t xml:space="preserve"> </w:t>
+      </w:r>
+      <w:proofErr w:type="spellStart"/>
+      <w:r>
+        <w:t>all</w:t>
+      </w:r>
+      <w:proofErr w:type="spellEnd"/>
+      <w:r>
+        <w:t xml:space="preserve"> </w:t>
+      </w:r>
+      <w:proofErr w:type="spellStart"/>
+      <w:r>
+        <w:t>of</w:t>
+      </w:r>
+      <w:proofErr w:type="spellEnd"/>
+      <w:r>
+        <w:t xml:space="preserve"> </w:t>
+      </w:r>
+      <w:proofErr w:type="spellStart"/>
+      <w:r>
+        <w:t>them</w:t>
+      </w:r>
+      <w:proofErr w:type="spellEnd"/>
+      <w:r>
+        <w:t xml:space="preserve"> </w:t>
+      </w:r>
+      <w:proofErr w:type="spellStart"/>
+      <w:r>
+        <w:t>and</w:t>
+      </w:r>
+      <w:proofErr w:type="spellEnd"/>
+      <w:r>
+        <w:t xml:space="preserve"> </w:t>
+      </w:r>
+      <w:proofErr w:type="spellStart"/>
       <w:r>
         <w:t>excluded</w:t>
       </w:r>
-      <w:r>
-        <w:t xml:space="preserve"> »we</w:t>
+      <w:proofErr w:type="spellEnd"/>
+      <w:r>
+        <w:t xml:space="preserve"> »</w:t>
+      </w:r>
+      <w:proofErr w:type="spellStart"/>
+      <w:r>
+        <w:t>we</w:t>
       </w:r>
       <w:r>
         <w:t>ir</w:t>
       </w:r>
       <w:r>
-        <w:t>d« ones</w:t>
-      </w:r>
+        <w:t>d</w:t>
+      </w:r>
+      <w:proofErr w:type="spellEnd"/>
+      <w:r>
+        <w:t xml:space="preserve">« </w:t>
+      </w:r>
+      <w:proofErr w:type="spellStart"/>
+      <w:r>
+        <w:t>ones</w:t>
+      </w:r>
+      <w:proofErr w:type="spellEnd"/>
       <w:r>
         <w:t>:</w:t>
       </w:r>
@@ -349,9 +1001,19 @@
           <w:numId w:val="1"/>
         </w:numPr>
       </w:pPr>
-      <w:r>
-        <w:t>Train: 7543 images</w:t>
-      </w:r>
+      <w:proofErr w:type="spellStart"/>
+      <w:r>
+        <w:t>Train</w:t>
+      </w:r>
+      <w:proofErr w:type="spellEnd"/>
+      <w:r>
+        <w:t xml:space="preserve">: 7543 </w:t>
+      </w:r>
+      <w:proofErr w:type="spellStart"/>
+      <w:r>
+        <w:t>images</w:t>
+      </w:r>
+      <w:proofErr w:type="spellEnd"/>
     </w:p>
     <w:p>
       <w:pPr>
@@ -362,8 +1024,13 @@
         </w:numPr>
       </w:pPr>
       <w:r>
-        <w:t>Val: 942 images</w:t>
-      </w:r>
+        <w:t xml:space="preserve">Val: 942 </w:t>
+      </w:r>
+      <w:proofErr w:type="spellStart"/>
+      <w:r>
+        <w:t>images</w:t>
+      </w:r>
+      <w:proofErr w:type="spellEnd"/>
     </w:p>
     <w:p>
       <w:pPr>
@@ -374,8 +1041,13 @@
         </w:numPr>
       </w:pPr>
       <w:r>
-        <w:t>Test: 944 images</w:t>
-      </w:r>
+        <w:t xml:space="preserve">Test: 944 </w:t>
+      </w:r>
+      <w:proofErr w:type="spellStart"/>
+      <w:r>
+        <w:t>images</w:t>
+      </w:r>
+      <w:proofErr w:type="spellEnd"/>
     </w:p>
     <w:p>
       <w:pPr>
@@ -385,15 +1057,108 @@
           <w:numId w:val="1"/>
         </w:numPr>
       </w:pPr>
-      <w:r>
-        <w:t xml:space="preserve">Made statistics on the dataset – histogram for </w:t>
-      </w:r>
+      <w:proofErr w:type="spellStart"/>
+      <w:r>
+        <w:t>Made</w:t>
+      </w:r>
+      <w:proofErr w:type="spellEnd"/>
+      <w:r>
+        <w:t xml:space="preserve"> </w:t>
+      </w:r>
+      <w:proofErr w:type="spellStart"/>
+      <w:r>
+        <w:t>statistics</w:t>
+      </w:r>
+      <w:proofErr w:type="spellEnd"/>
+      <w:r>
+        <w:t xml:space="preserve"> on </w:t>
+      </w:r>
+      <w:proofErr w:type="spellStart"/>
+      <w:r>
+        <w:t>the</w:t>
+      </w:r>
+      <w:proofErr w:type="spellEnd"/>
+      <w:r>
+        <w:t xml:space="preserve"> </w:t>
+      </w:r>
+      <w:proofErr w:type="spellStart"/>
+      <w:r>
+        <w:t>dataset</w:t>
+      </w:r>
+      <w:proofErr w:type="spellEnd"/>
+      <w:r>
+        <w:t xml:space="preserve"> – histogram </w:t>
+      </w:r>
+      <w:proofErr w:type="spellStart"/>
+      <w:r>
+        <w:t>for</w:t>
+      </w:r>
+      <w:proofErr w:type="spellEnd"/>
+      <w:r>
+        <w:t xml:space="preserve"> </w:t>
+      </w:r>
+      <w:proofErr w:type="spellStart"/>
       <w:r>
         <w:t>unique</w:t>
       </w:r>
-      <w:r>
-        <w:t xml:space="preserve"> exercises and users</w:t>
-      </w:r>
+      <w:proofErr w:type="spellEnd"/>
+      <w:r>
+        <w:t xml:space="preserve"> </w:t>
+      </w:r>
+      <w:proofErr w:type="spellStart"/>
+      <w:r>
+        <w:t>exercises</w:t>
+      </w:r>
+      <w:proofErr w:type="spellEnd"/>
+      <w:r>
+        <w:t xml:space="preserve"> </w:t>
+      </w:r>
+      <w:proofErr w:type="spellStart"/>
+      <w:r>
+        <w:t>and</w:t>
+      </w:r>
+      <w:proofErr w:type="spellEnd"/>
+      <w:r>
+        <w:t xml:space="preserve"> </w:t>
+      </w:r>
+      <w:proofErr w:type="spellStart"/>
+      <w:r>
+        <w:t>users</w:t>
+      </w:r>
+      <w:proofErr w:type="spellEnd"/>
+    </w:p>
+    <w:p>
+      <w:pPr>
+        <w:pStyle w:val="ListParagraph"/>
+        <w:numPr>
+          <w:ilvl w:val="1"/>
+          <w:numId w:val="1"/>
+        </w:numPr>
+      </w:pPr>
+      <w:r>
+        <w:t xml:space="preserve">Podrobna analiza </w:t>
+      </w:r>
+      <w:proofErr w:type="spellStart"/>
+      <w:r>
+        <w:t>dataseta</w:t>
+      </w:r>
+      <w:proofErr w:type="spellEnd"/>
+      <w:r>
+        <w:t xml:space="preserve"> – spol, age, </w:t>
+      </w:r>
+      <w:proofErr w:type="spellStart"/>
+      <w:r>
+        <w:t>nationality</w:t>
+      </w:r>
+      <w:proofErr w:type="spellEnd"/>
+      <w:r>
+        <w:t>/</w:t>
+      </w:r>
+      <w:proofErr w:type="spellStart"/>
+      <w:r>
+        <w:t>region</w:t>
+      </w:r>
+      <w:proofErr w:type="spellEnd"/>
     </w:p>
     <w:p>
       <w:pPr>
@@ -403,8 +1168,83 @@
           <w:numId w:val="1"/>
         </w:numPr>
       </w:pPr>
-      <w:r>
-        <w:t>Generated »Ground-Truth« labels (keypoint positions) with RTMO-X model on the dataset</w:t>
+      <w:proofErr w:type="spellStart"/>
+      <w:r>
+        <w:t>Generated</w:t>
+      </w:r>
+      <w:proofErr w:type="spellEnd"/>
+      <w:r>
+        <w:t xml:space="preserve"> »</w:t>
+      </w:r>
+      <w:proofErr w:type="spellStart"/>
+      <w:r>
+        <w:t>Ground-Truth</w:t>
+      </w:r>
+      <w:proofErr w:type="spellEnd"/>
+      <w:r>
+        <w:t xml:space="preserve">« </w:t>
+      </w:r>
+      <w:proofErr w:type="spellStart"/>
+      <w:r>
+        <w:t>labels</w:t>
+      </w:r>
+      <w:proofErr w:type="spellEnd"/>
+      <w:r>
+        <w:t xml:space="preserve"> (</w:t>
+      </w:r>
+      <w:proofErr w:type="spellStart"/>
+      <w:r>
+        <w:t>keypoint</w:t>
+      </w:r>
+      <w:proofErr w:type="spellEnd"/>
+      <w:r>
+        <w:t xml:space="preserve"> </w:t>
+      </w:r>
+      <w:proofErr w:type="spellStart"/>
+      <w:r>
+        <w:t>positions</w:t>
+      </w:r>
+      <w:proofErr w:type="spellEnd"/>
+      <w:r>
+        <w:t xml:space="preserve">) </w:t>
+      </w:r>
+      <w:proofErr w:type="spellStart"/>
+      <w:r>
+        <w:t>with</w:t>
+      </w:r>
+      <w:proofErr w:type="spellEnd"/>
+      <w:r>
+        <w:t xml:space="preserve"> RTMO-X model on </w:t>
+      </w:r>
+      <w:proofErr w:type="spellStart"/>
+      <w:r>
+        <w:t>the</w:t>
+      </w:r>
+      <w:proofErr w:type="spellEnd"/>
+      <w:r>
+        <w:t xml:space="preserve"> </w:t>
+      </w:r>
+      <w:proofErr w:type="spellStart"/>
+      <w:r>
+        <w:t>dataset</w:t>
+      </w:r>
+      <w:proofErr w:type="spellEnd"/>
+    </w:p>
+    <w:p>
+      <w:pPr>
+        <w:pStyle w:val="ListParagraph"/>
+        <w:numPr>
+          <w:ilvl w:val="1"/>
+          <w:numId w:val="1"/>
+        </w:numPr>
+      </w:pPr>
+      <w:proofErr w:type="spellStart"/>
+      <w:r>
+        <w:t>Statistics</w:t>
+      </w:r>
+      <w:proofErr w:type="spellEnd"/>
+      <w:r>
+        <w:t>: koliko % slik sem zavrnil (napačna zaznava RTMO-X)</w:t>
       </w:r>
     </w:p>
     <w:p>
@@ -416,13 +1256,106 @@
         </w:numPr>
       </w:pPr>
       <w:r>
-        <w:t>Used the new test dataset for the main model evaluation metho</w:t>
+        <w:t xml:space="preserve">Used </w:t>
+      </w:r>
+      <w:proofErr w:type="spellStart"/>
+      <w:r>
+        <w:t>the</w:t>
+      </w:r>
+      <w:proofErr w:type="spellEnd"/>
+      <w:r>
+        <w:t xml:space="preserve"> </w:t>
+      </w:r>
+      <w:proofErr w:type="spellStart"/>
+      <w:r>
+        <w:t>new</w:t>
+      </w:r>
+      <w:proofErr w:type="spellEnd"/>
+      <w:r>
+        <w:t xml:space="preserve"> test </w:t>
+      </w:r>
+      <w:proofErr w:type="spellStart"/>
+      <w:r>
+        <w:t>dataset</w:t>
+      </w:r>
+      <w:proofErr w:type="spellEnd"/>
+      <w:r>
+        <w:t xml:space="preserve"> </w:t>
+      </w:r>
+      <w:proofErr w:type="spellStart"/>
+      <w:r>
+        <w:t>for</w:t>
+      </w:r>
+      <w:proofErr w:type="spellEnd"/>
+      <w:r>
+        <w:t xml:space="preserve"> </w:t>
+      </w:r>
+      <w:proofErr w:type="spellStart"/>
+      <w:r>
+        <w:t>the</w:t>
+      </w:r>
+      <w:proofErr w:type="spellEnd"/>
+      <w:r>
+        <w:t xml:space="preserve"> </w:t>
+      </w:r>
+      <w:proofErr w:type="spellStart"/>
+      <w:r>
+        <w:t>main</w:t>
+      </w:r>
+      <w:proofErr w:type="spellEnd"/>
+      <w:r>
+        <w:t xml:space="preserve"> model </w:t>
+      </w:r>
+      <w:proofErr w:type="spellStart"/>
+      <w:r>
+        <w:t>evaluation</w:t>
+      </w:r>
+      <w:proofErr w:type="spellEnd"/>
+      <w:r>
+        <w:t xml:space="preserve"> </w:t>
+      </w:r>
+      <w:proofErr w:type="spellStart"/>
+      <w:r>
+        <w:t>metho</w:t>
       </w:r>
       <w:r>
         <w:t>d</w:t>
       </w:r>
-      <w:r>
-        <w:t xml:space="preserve"> (besides the seperate exercises)</w:t>
+      <w:proofErr w:type="spellEnd"/>
+      <w:r>
+        <w:t xml:space="preserve"> (</w:t>
+      </w:r>
+      <w:proofErr w:type="spellStart"/>
+      <w:r>
+        <w:t>besides</w:t>
+      </w:r>
+      <w:proofErr w:type="spellEnd"/>
+      <w:r>
+        <w:t xml:space="preserve"> </w:t>
+      </w:r>
+      <w:proofErr w:type="spellStart"/>
+      <w:r>
+        <w:t>the</w:t>
+      </w:r>
+      <w:proofErr w:type="spellEnd"/>
+      <w:r>
+        <w:t xml:space="preserve"> </w:t>
+      </w:r>
+      <w:proofErr w:type="spellStart"/>
+      <w:r>
+        <w:t>seperate</w:t>
+      </w:r>
+      <w:proofErr w:type="spellEnd"/>
+      <w:r>
+        <w:t xml:space="preserve"> </w:t>
+      </w:r>
+      <w:proofErr w:type="spellStart"/>
+      <w:r>
+        <w:t>exercises</w:t>
+      </w:r>
+      <w:proofErr w:type="spellEnd"/>
+      <w:r>
+        <w:t>)</w:t>
       </w:r>
     </w:p>
     <w:p>
@@ -434,16 +1367,75 @@
         </w:numPr>
       </w:pPr>
       <w:r>
+        <w:lastRenderedPageBreak/>
         <w:t xml:space="preserve">Trained one </w:t>
       </w:r>
-      <w:r>
-        <w:t xml:space="preserve">the </w:t>
-      </w:r>
-      <w:r>
-        <w:t>models – YOLO11n_256</w:t>
-      </w:r>
-      <w:r>
-        <w:t xml:space="preserve"> (easiest to train and had space to improve)</w:t>
+      <w:proofErr w:type="spellStart"/>
+      <w:r>
+        <w:t>the</w:t>
+      </w:r>
+      <w:proofErr w:type="spellEnd"/>
+      <w:r>
+        <w:t xml:space="preserve"> </w:t>
+      </w:r>
+      <w:proofErr w:type="spellStart"/>
+      <w:r>
+        <w:t>models</w:t>
+      </w:r>
+      <w:proofErr w:type="spellEnd"/>
+      <w:r>
+        <w:t xml:space="preserve"> – YOLO11n_256</w:t>
+      </w:r>
+      <w:r>
+        <w:t xml:space="preserve"> (</w:t>
+      </w:r>
+      <w:proofErr w:type="spellStart"/>
+      <w:r>
+        <w:t>easiest</w:t>
+      </w:r>
+      <w:proofErr w:type="spellEnd"/>
+      <w:r>
+        <w:t xml:space="preserve"> to </w:t>
+      </w:r>
+      <w:proofErr w:type="spellStart"/>
+      <w:r>
+        <w:t>train</w:t>
+      </w:r>
+      <w:proofErr w:type="spellEnd"/>
+      <w:r>
+        <w:t xml:space="preserve"> </w:t>
+      </w:r>
+      <w:proofErr w:type="spellStart"/>
+      <w:r>
+        <w:t>and</w:t>
+      </w:r>
+      <w:proofErr w:type="spellEnd"/>
+      <w:r>
+        <w:t xml:space="preserve"> </w:t>
+      </w:r>
+      <w:proofErr w:type="spellStart"/>
+      <w:r>
+        <w:t>had</w:t>
+      </w:r>
+      <w:proofErr w:type="spellEnd"/>
+      <w:r>
+        <w:t xml:space="preserve"> </w:t>
+      </w:r>
+      <w:proofErr w:type="spellStart"/>
+      <w:r>
+        <w:t>space</w:t>
+      </w:r>
+      <w:proofErr w:type="spellEnd"/>
+      <w:r>
+        <w:t xml:space="preserve"> to </w:t>
+      </w:r>
+      <w:proofErr w:type="spellStart"/>
+      <w:r>
+        <w:t>improve</w:t>
+      </w:r>
+      <w:proofErr w:type="spellEnd"/>
+      <w:r>
+        <w:t>)</w:t>
       </w:r>
     </w:p>
     <w:p>
@@ -454,9 +1446,67 @@
           <w:numId w:val="1"/>
         </w:numPr>
       </w:pPr>
-      <w:r>
-        <w:t>Evaluated new trained model results – the results were very good</w:t>
-      </w:r>
+      <w:proofErr w:type="spellStart"/>
+      <w:r>
+        <w:t>Evaluated</w:t>
+      </w:r>
+      <w:proofErr w:type="spellEnd"/>
+      <w:r>
+        <w:t xml:space="preserve"> </w:t>
+      </w:r>
+      <w:proofErr w:type="spellStart"/>
+      <w:r>
+        <w:t>new</w:t>
+      </w:r>
+      <w:proofErr w:type="spellEnd"/>
+      <w:r>
+        <w:t xml:space="preserve"> trained model </w:t>
+      </w:r>
+      <w:proofErr w:type="spellStart"/>
+      <w:r>
+        <w:t>results</w:t>
+      </w:r>
+      <w:proofErr w:type="spellEnd"/>
+      <w:r>
+        <w:t xml:space="preserve"> – </w:t>
+      </w:r>
+      <w:proofErr w:type="spellStart"/>
+      <w:r>
+        <w:t>the</w:t>
+      </w:r>
+      <w:proofErr w:type="spellEnd"/>
+      <w:r>
+        <w:t xml:space="preserve"> </w:t>
+      </w:r>
+      <w:proofErr w:type="spellStart"/>
+      <w:r>
+        <w:t>results</w:t>
+      </w:r>
+      <w:proofErr w:type="spellEnd"/>
+      <w:r>
+        <w:t xml:space="preserve"> </w:t>
+      </w:r>
+      <w:proofErr w:type="spellStart"/>
+      <w:r>
+        <w:t>were</w:t>
+      </w:r>
+      <w:proofErr w:type="spellEnd"/>
+      <w:r>
+        <w:t xml:space="preserve"> </w:t>
+      </w:r>
+      <w:proofErr w:type="spellStart"/>
+      <w:r>
+        <w:t>very</w:t>
+      </w:r>
+      <w:proofErr w:type="spellEnd"/>
+      <w:r>
+        <w:t xml:space="preserve"> </w:t>
+      </w:r>
+      <w:proofErr w:type="spellStart"/>
+      <w:r>
+        <w:t>good</w:t>
+      </w:r>
+      <w:proofErr w:type="spellEnd"/>
     </w:p>
     <w:sectPr>
       <w:pgSz w:w="11906" w:h="16838"/>

</xml_diff>